<commit_message>
Correct location, JET/Suitsupply dates, and ITSM tools
Update clinton-cv facts and Rituals materials: Almere; Just Eat
Takeaway from November 2024; Suitsupply as ZZP under CGI until 2024;
daily Jira/Confluence; peripheral ServiceNow store-incident rollout
and CGI training without overclaiming.

Co-authored-by: clintonherring <clintonherring@users.noreply.github.com>
</commit_message>
<xml_diff>
--- a/skills/custom/clinton-cv/assets/Clinton_Herring_Rituals_Cover_Letter.docx
+++ b/skills/custom/clinton-cv/assets/Clinton_Herring_Rituals_Cover_Letter.docx
@@ -10,8 +10,6 @@
         <w:rPr>
           <w:b/>
           <w:bCs/>
-          <w:i w:val="false"/>
-          <w:iCs w:val="false"/>
           <w:color w:val="1A2332"/>
           <w:sz w:val="22"/>
           <w:szCs w:val="22"/>
@@ -28,14 +26,12 @@
         <w:rPr>
           <w:b w:val="false"/>
           <w:bCs w:val="false"/>
-          <w:i w:val="false"/>
-          <w:iCs w:val="false"/>
-          <w:color w:val="1A2332"/>
-          <w:sz w:val="22"/>
-          <w:szCs w:val="22"/>
-          <w:rFonts w:ascii="Calibri" w:cs="Calibri" w:eastAsia="Calibri" w:hAnsi="Calibri"/>
-        </w:rPr>
-        <w:t xml:space="preserve">Enschede  ·  +31 6 27517972  ·  Clinton.herring@remoteconsulting.eu</w:t>
+          <w:color w:val="1A2332"/>
+          <w:sz w:val="22"/>
+          <w:szCs w:val="22"/>
+          <w:rFonts w:ascii="Calibri" w:cs="Calibri" w:eastAsia="Calibri" w:hAnsi="Calibri"/>
+        </w:rPr>
+        <w:t xml:space="preserve">Almere  ·  +31 6 27517972  ·  Clinton.herring@remoteconsulting.eu</w:t>
       </w:r>
     </w:p>
     <w:p>
@@ -46,8 +42,6 @@
         <w:rPr>
           <w:b w:val="false"/>
           <w:bCs w:val="false"/>
-          <w:i w:val="false"/>
-          <w:iCs w:val="false"/>
           <w:color w:val="1A2332"/>
           <w:sz w:val="22"/>
           <w:szCs w:val="22"/>
@@ -64,8 +58,6 @@
         <w:rPr>
           <w:b w:val="false"/>
           <w:bCs w:val="false"/>
-          <w:i w:val="false"/>
-          <w:iCs w:val="false"/>
           <w:color w:val="1A2332"/>
           <w:sz w:val="22"/>
           <w:szCs w:val="22"/>
@@ -82,8 +74,6 @@
         <w:rPr>
           <w:b w:val="false"/>
           <w:bCs w:val="false"/>
-          <w:i w:val="false"/>
-          <w:iCs w:val="false"/>
           <w:color w:val="1A2332"/>
           <w:sz w:val="22"/>
           <w:szCs w:val="22"/>
@@ -100,8 +90,6 @@
         <w:rPr>
           <w:b w:val="false"/>
           <w:bCs w:val="false"/>
-          <w:i w:val="false"/>
-          <w:iCs w:val="false"/>
           <w:color w:val="1A2332"/>
           <w:sz w:val="22"/>
           <w:szCs w:val="22"/>
@@ -118,44 +106,54 @@
         <w:rPr>
           <w:b w:val="false"/>
           <w:bCs w:val="false"/>
-          <w:i w:val="false"/>
-          <w:iCs w:val="false"/>
-          <w:color w:val="1A2332"/>
-          <w:sz w:val="22"/>
-          <w:szCs w:val="22"/>
-          <w:rFonts w:ascii="Calibri" w:cs="Calibri" w:eastAsia="Calibri" w:hAnsi="Calibri"/>
-        </w:rPr>
-        <w:t xml:space="preserve">Since CGI I have done comparable retail architecture for Suitsupply, and I have been working as a platform engineer with Just Eat Takeaway. That platform work, including AI-assisted ways of spotting and fixing operational issues, is how I would help Rituals move from reactive firefighting toward the proactive and predictive technology management described in the role.</w:t>
-      </w:r>
-    </w:p>
-    <w:p>
-      <w:pPr>
-        <w:spacing w:after="160" w:line="276"/>
-      </w:pPr>
-      <w:r>
-        <w:rPr>
-          <w:b w:val="false"/>
-          <w:bCs w:val="false"/>
-          <w:i w:val="false"/>
-          <w:iCs w:val="false"/>
-          <w:color w:val="1A2332"/>
-          <w:sz w:val="22"/>
-          <w:szCs w:val="22"/>
-          <w:rFonts w:ascii="Calibri" w:cs="Calibri" w:eastAsia="Calibri" w:hAnsi="Calibri"/>
-        </w:rPr>
-        <w:t xml:space="preserve">I am based in Enschede, with a residence permit (arbeid vrij toegestaan, TWV niet vereist), and I am used to owning architecture across engineers, suppliers, and retail stakeholders.</w:t>
-      </w:r>
-    </w:p>
-    <w:p>
-      <w:pPr>
-        <w:spacing w:after="160" w:line="276"/>
-      </w:pPr>
-      <w:r>
-        <w:rPr>
-          <w:b w:val="false"/>
-          <w:bCs w:val="false"/>
-          <w:i w:val="false"/>
-          <w:iCs w:val="false"/>
+          <w:color w:val="1A2332"/>
+          <w:sz w:val="22"/>
+          <w:szCs w:val="22"/>
+          <w:rFonts w:ascii="Calibri" w:cs="Calibri" w:eastAsia="Calibri" w:hAnsi="Calibri"/>
+        </w:rPr>
+        <w:t xml:space="preserve">I use Jira and Confluence every day for documentation and task management. When CGI rolled ServiceNow out to stores as the incident-management service I was involved at the edge of that programme and completed CGI’s ServiceNow training — I am not claiming ServiceNow implementation ownership, but I know how that model sits next to store operations.</w:t>
+      </w:r>
+    </w:p>
+    <w:p>
+      <w:pPr>
+        <w:spacing w:after="160" w:line="276"/>
+      </w:pPr>
+      <w:r>
+        <w:rPr>
+          <w:b w:val="false"/>
+          <w:bCs w:val="false"/>
+          <w:color w:val="1A2332"/>
+          <w:sz w:val="22"/>
+          <w:szCs w:val="22"/>
+          <w:rFonts w:ascii="Calibri" w:cs="Calibri" w:eastAsia="Calibri" w:hAnsi="Calibri"/>
+        </w:rPr>
+        <w:t xml:space="preserve">After CGI I continued as a sole proprietor under contract with CGI as Principal Architect for Suitsupply until 2024. Since November 2024 I have been a platform engineer at Just Eat Takeaway. That platform work, including AI-assisted ways of spotting and fixing operational issues, is how I would help Rituals move from reactive firefighting toward the proactive and predictive technology management described in the role.</w:t>
+      </w:r>
+    </w:p>
+    <w:p>
+      <w:pPr>
+        <w:spacing w:after="160" w:line="276"/>
+      </w:pPr>
+      <w:r>
+        <w:rPr>
+          <w:b w:val="false"/>
+          <w:bCs w:val="false"/>
+          <w:color w:val="1A2332"/>
+          <w:sz w:val="22"/>
+          <w:szCs w:val="22"/>
+          <w:rFonts w:ascii="Calibri" w:cs="Calibri" w:eastAsia="Calibri" w:hAnsi="Calibri"/>
+        </w:rPr>
+        <w:t xml:space="preserve">I am based in Almere, close to Amsterdam, with a residence permit (arbeid vrij toegestaan, TWV niet vereist), and I am used to owning architecture across engineers, suppliers, and retail stakeholders.</w:t>
+      </w:r>
+    </w:p>
+    <w:p>
+      <w:pPr>
+        <w:spacing w:after="160" w:line="276"/>
+      </w:pPr>
+      <w:r>
+        <w:rPr>
+          <w:b w:val="false"/>
+          <w:bCs w:val="false"/>
           <w:color w:val="1A2332"/>
           <w:sz w:val="22"/>
           <w:szCs w:val="22"/>
@@ -172,8 +170,6 @@
         <w:rPr>
           <w:b w:val="false"/>
           <w:bCs w:val="false"/>
-          <w:i w:val="false"/>
-          <w:iCs w:val="false"/>
           <w:color w:val="1A2332"/>
           <w:sz w:val="22"/>
           <w:szCs w:val="22"/>
@@ -190,8 +186,6 @@
         <w:rPr>
           <w:b/>
           <w:bCs/>
-          <w:i w:val="false"/>
-          <w:iCs w:val="false"/>
           <w:color w:val="1A2332"/>
           <w:sz w:val="22"/>
           <w:szCs w:val="22"/>
@@ -208,8 +202,6 @@
         <w:rPr>
           <w:b w:val="false"/>
           <w:bCs w:val="false"/>
-          <w:i w:val="false"/>
-          <w:iCs w:val="false"/>
           <w:color w:val="1A2332"/>
           <w:sz w:val="22"/>
           <w:szCs w:val="22"/>
@@ -226,8 +218,6 @@
         <w:rPr>
           <w:b w:val="false"/>
           <w:bCs w:val="false"/>
-          <w:i w:val="false"/>
-          <w:iCs w:val="false"/>
           <w:color w:val="1A2332"/>
           <w:sz w:val="22"/>
           <w:szCs w:val="22"/>

</xml_diff>

<commit_message>
Highlight contractor management and existing Rituals vendor ties
Add Allan Gray’s 15-year contractor/vendor management and existing
CGI/ZZP relationships with Rituals suppliers to the clinton-cv facts
and Rituals application documents.

Co-authored-by: clintonherring <clintonherring@users.noreply.github.com>
</commit_message>
<xml_diff>
--- a/skills/custom/clinton-cv/assets/Clinton_Herring_Rituals_Cover_Letter.docx
+++ b/skills/custom/clinton-cv/assets/Clinton_Herring_Rituals_Cover_Letter.docx
@@ -127,7 +127,23 @@
           <w:szCs w:val="22"/>
           <w:rFonts w:ascii="Calibri" w:cs="Calibri" w:eastAsia="Calibri" w:hAnsi="Calibri"/>
         </w:rPr>
-        <w:t xml:space="preserve">After CGI I continued as a sole proprietor under contract with CGI as Principal Architect for Suitsupply until 2024. Since November 2024 I have been a platform engineer at Just Eat Takeaway. That platform work, including AI-assisted ways of spotting and fixing operational issues, is how I would help Rituals move from reactive firefighting toward the proactive and predictive technology management described in the role.</w:t>
+        <w:t xml:space="preserve">After CGI I continued as a sole proprietor under contract with CGI as Principal Architect for Suitsupply until 2024. I already have working relationships with several of Rituals’ vendors from that CGI and ZZP period. For 15 years at Allan Gray I managed contractors and third-party suppliers in financial services — so I am used to being the architectural owner who holds partners to standard, not only the designer of the stack.</w:t>
+      </w:r>
+    </w:p>
+    <w:p>
+      <w:pPr>
+        <w:spacing w:after="160" w:line="276"/>
+      </w:pPr>
+      <w:r>
+        <w:rPr>
+          <w:b w:val="false"/>
+          <w:bCs w:val="false"/>
+          <w:color w:val="1A2332"/>
+          <w:sz w:val="22"/>
+          <w:szCs w:val="22"/>
+          <w:rFonts w:ascii="Calibri" w:cs="Calibri" w:eastAsia="Calibri" w:hAnsi="Calibri"/>
+        </w:rPr>
+        <w:t xml:space="preserve">Since November 2024 I have been a platform engineer at Just Eat Takeaway. That platform work, including AI-assisted ways of spotting and fixing operational issues, is how I would help Rituals move from reactive firefighting toward the proactive and predictive technology management described in the role.</w:t>
       </w:r>
     </w:p>
     <w:p>

</xml_diff>

<commit_message>
Rebalance Rituals CV: architecture first, vendor map as support
Capture Veducon / CGI+NewBlack / RSG as landscape examples and keep
the job-spec lead on end-to-end store architecture ownership rather
than a vendor directory.

Co-authored-by: clintonherring <clintonherring@users.noreply.github.com>
</commit_message>
<xml_diff>
--- a/skills/custom/clinton-cv/assets/Clinton_Herring_Rituals_Cover_Letter.docx
+++ b/skills/custom/clinton-cv/assets/Clinton_Herring_Rituals_Cover_Letter.docx
@@ -95,71 +95,55 @@
           <w:szCs w:val="22"/>
           <w:rFonts w:ascii="Calibri" w:cs="Calibri" w:eastAsia="Calibri" w:hAnsi="Calibri"/>
         </w:rPr>
-        <w:t xml:space="preserve">I already know this landscape from the supplier side. As Principal Architect at CGI I worked on the store technology estate that supports Rituals and similar retail — Meraki networking, POS and payment terminals, multi-site rollout, and handover into support. I understand how CGI’s call-centre model works with the stores, and I have worked with Veducon. I was involved with the team that moved POS off Cowhills onto the NewBlack stack: iPads on the floor, with a Mac in the back room running the POS environment. I know where Jamf sits in that Apple-centred store pattern; I am not positioning myself as a Jamf specialist, but I understand how device management, POS, and networking have to fit together for a supportable store.</w:t>
-      </w:r>
-    </w:p>
-    <w:p>
-      <w:pPr>
-        <w:spacing w:after="160" w:line="276"/>
-      </w:pPr>
-      <w:r>
-        <w:rPr>
-          <w:b w:val="false"/>
-          <w:bCs w:val="false"/>
-          <w:color w:val="1A2332"/>
-          <w:sz w:val="22"/>
-          <w:szCs w:val="22"/>
-          <w:rFonts w:ascii="Calibri" w:cs="Calibri" w:eastAsia="Calibri" w:hAnsi="Calibri"/>
-        </w:rPr>
-        <w:t xml:space="preserve">I use Jira and Confluence every day for documentation and task management. When CGI rolled ServiceNow out to stores as the incident-management service I was involved at the edge of that programme and completed CGI’s ServiceNow training — I am not claiming ServiceNow implementation ownership, but I know how that model sits next to store operations.</w:t>
-      </w:r>
-    </w:p>
-    <w:p>
-      <w:pPr>
-        <w:spacing w:after="160" w:line="276"/>
-      </w:pPr>
-      <w:r>
-        <w:rPr>
-          <w:b w:val="false"/>
-          <w:bCs w:val="false"/>
-          <w:color w:val="1A2332"/>
-          <w:sz w:val="22"/>
-          <w:szCs w:val="22"/>
-          <w:rFonts w:ascii="Calibri" w:cs="Calibri" w:eastAsia="Calibri" w:hAnsi="Calibri"/>
-        </w:rPr>
-        <w:t xml:space="preserve">After CGI I continued as a sole proprietor under contract with CGI as Principal Architect for Suitsupply until 2024. I already have working relationships with several of Rituals’ vendors from that CGI and ZZP period. For 15 years at Allan Gray I managed contractors and third-party suppliers in financial services — so I am used to being the architectural owner who holds partners to standard, not only the designer of the stack.</w:t>
-      </w:r>
-    </w:p>
-    <w:p>
-      <w:pPr>
-        <w:spacing w:after="160" w:line="276"/>
-      </w:pPr>
-      <w:r>
-        <w:rPr>
-          <w:b w:val="false"/>
-          <w:bCs w:val="false"/>
-          <w:color w:val="1A2332"/>
-          <w:sz w:val="22"/>
-          <w:szCs w:val="22"/>
-          <w:rFonts w:ascii="Calibri" w:cs="Calibri" w:eastAsia="Calibri" w:hAnsi="Calibri"/>
-        </w:rPr>
-        <w:t xml:space="preserve">Since November 2024 I have been a platform engineer at Just Eat Takeaway. That platform work, including AI-assisted ways of spotting and fixing operational issues, is how I would help Rituals move from reactive firefighting toward the proactive and predictive technology management described in the role.</w:t>
-      </w:r>
-    </w:p>
-    <w:p>
-      <w:pPr>
-        <w:spacing w:after="160" w:line="276"/>
-      </w:pPr>
-      <w:r>
-        <w:rPr>
-          <w:b w:val="false"/>
-          <w:bCs w:val="false"/>
-          <w:color w:val="1A2332"/>
-          <w:sz w:val="22"/>
-          <w:szCs w:val="22"/>
-          <w:rFonts w:ascii="Calibri" w:cs="Calibri" w:eastAsia="Calibri" w:hAnsi="Calibri"/>
-        </w:rPr>
-        <w:t xml:space="preserve">I am based in Almere, close to Amsterdam, with a residence permit (arbeid vrij toegestaan, TWV niet vereist), and I am used to owning architecture across engineers, suppliers, and retail stakeholders.</w:t>
+        <w:t xml:space="preserve">What I bring first is architectural ownership of store technology: standards, lifecycle, and designs that operations can support. At CGI I worked on the store estate that supports Rituals and similar retail — Meraki networking, POS and payment terminals, multi-site rollout, and handover into support. I was involved with the team that moved POS off Cowhills onto NewBlack (iPads on the floor; Mac in the back room). I use Jira and Confluence daily, and when CGI rolled ServiceNow out to stores as incident management I was involved at the edge of that programme and completed CGI’s training.</w:t>
+      </w:r>
+    </w:p>
+    <w:p>
+      <w:pPr>
+        <w:spacing w:after="160" w:line="276"/>
+      </w:pPr>
+      <w:r>
+        <w:rPr>
+          <w:b w:val="false"/>
+          <w:bCs w:val="false"/>
+          <w:color w:val="1A2332"/>
+          <w:sz w:val="22"/>
+          <w:szCs w:val="22"/>
+          <w:rFonts w:ascii="Calibri" w:cs="Calibri" w:eastAsia="Calibri" w:hAnsi="Calibri"/>
+        </w:rPr>
+        <w:t xml:space="preserve">I also understand how Rituals’ vendors fit together — for example Veducon for network design, CGI with NewBlack for omnichannel, and RSG for in-store rollout and break-fix — and I already have working relationships from CGI and later ZZP work. For 15 years at Allan Gray I managed contractors in financial services, so I am used to holding partners to standard, not only designing the stack.</w:t>
+      </w:r>
+    </w:p>
+    <w:p>
+      <w:pPr>
+        <w:spacing w:after="160" w:line="276"/>
+      </w:pPr>
+      <w:r>
+        <w:rPr>
+          <w:b w:val="false"/>
+          <w:bCs w:val="false"/>
+          <w:color w:val="1A2332"/>
+          <w:sz w:val="22"/>
+          <w:szCs w:val="22"/>
+          <w:rFonts w:ascii="Calibri" w:cs="Calibri" w:eastAsia="Calibri" w:hAnsi="Calibri"/>
+        </w:rPr>
+        <w:t xml:space="preserve">After CGI I continued as a sole proprietor under contract with CGI as Principal Architect for Suitsupply until 2024. Since November 2024 I have been a platform engineer at Just Eat Takeaway. That platform work, including AI-assisted ways of spotting and fixing operational issues, is how I would help Rituals move toward the proactive and predictive technology management described in the role.</w:t>
+      </w:r>
+    </w:p>
+    <w:p>
+      <w:pPr>
+        <w:spacing w:after="160" w:line="276"/>
+      </w:pPr>
+      <w:r>
+        <w:rPr>
+          <w:b w:val="false"/>
+          <w:bCs w:val="false"/>
+          <w:color w:val="1A2332"/>
+          <w:sz w:val="22"/>
+          <w:szCs w:val="22"/>
+          <w:rFonts w:ascii="Calibri" w:cs="Calibri" w:eastAsia="Calibri" w:hAnsi="Calibri"/>
+        </w:rPr>
+        <w:t xml:space="preserve">I am based in Almere, close to Amsterdam, with a residence permit (arbeid vrij toegestaan, TWV niet vereist).</w:t>
       </w:r>
     </w:p>
     <w:p>

</xml_diff>

<commit_message>
Second-pass review of Rituals CV and clinton-cv skill
Tighten profile, map strengths to the job spec, collapse 2022-present
into one umbrella with dated JET and Suitsupply entries, ground JET
bullets in repo evidence (incident RCA, AI agent skills), remove
negative hedges from the CV body, and make document generation
reproducible via a single script with package.json.

Co-authored-by: clintonherring <clintonherring@users.noreply.github.com>
</commit_message>
<xml_diff>
--- a/skills/custom/clinton-cv/assets/Clinton_Herring_Rituals_Cover_Letter.docx
+++ b/skills/custom/clinton-cv/assets/Clinton_Herring_Rituals_Cover_Letter.docx
@@ -20,22 +20,6 @@
     </w:p>
     <w:p>
       <w:pPr>
-        <w:spacing w:after="40" w:line="276"/>
-      </w:pPr>
-      <w:r>
-        <w:rPr>
-          <w:b w:val="false"/>
-          <w:bCs w:val="false"/>
-          <w:color w:val="1A2332"/>
-          <w:sz w:val="22"/>
-          <w:szCs w:val="22"/>
-          <w:rFonts w:ascii="Calibri" w:cs="Calibri" w:eastAsia="Calibri" w:hAnsi="Calibri"/>
-        </w:rPr>
-        <w:t xml:space="preserve">Almere  ·  +31 6 27517972  ·  Clinton.herring@remoteconsulting.eu</w:t>
-      </w:r>
-    </w:p>
-    <w:p>
-      <w:pPr>
         <w:spacing w:after="320" w:line="276"/>
       </w:pPr>
       <w:r>
@@ -47,7 +31,7 @@
           <w:szCs w:val="22"/>
           <w:rFonts w:ascii="Calibri" w:cs="Calibri" w:eastAsia="Calibri" w:hAnsi="Calibri"/>
         </w:rPr>
-        <w:t xml:space="preserve">https://www.remoteconsulting.eu</w:t>
+        <w:t xml:space="preserve">Almere  ·  +31 6 27517972  ·  Clinton.herring@remoteconsulting.eu  ·  remoteconsulting.eu</w:t>
       </w:r>
     </w:p>
     <w:p>
@@ -63,7 +47,7 @@
           <w:szCs w:val="22"/>
           <w:rFonts w:ascii="Calibri" w:cs="Calibri" w:eastAsia="Calibri" w:hAnsi="Calibri"/>
         </w:rPr>
-        <w:t xml:space="preserve">Dear hiring team,</w:t>
+        <w:t xml:space="preserve">Dear Renée and the Retail Technology team,</w:t>
       </w:r>
     </w:p>
     <w:p>
@@ -79,7 +63,7 @@
           <w:szCs w:val="22"/>
           <w:rFonts w:ascii="Calibri" w:cs="Calibri" w:eastAsia="Calibri" w:hAnsi="Calibri"/>
         </w:rPr>
-        <w:t xml:space="preserve">I am applying for the Retail Technology IT Architect role at Rituals.</w:t>
+        <w:t xml:space="preserve">I am applying for the Retail Technology IT Architect role. I know the Rituals store landscape from the supplier side, and I have spent the last few years doing exactly the work this role describes: owning store-technology architecture, holding partners to standards, and turning recurring incidents into structural fixes.</w:t>
       </w:r>
     </w:p>
     <w:p>
@@ -95,7 +79,7 @@
           <w:szCs w:val="22"/>
           <w:rFonts w:ascii="Calibri" w:cs="Calibri" w:eastAsia="Calibri" w:hAnsi="Calibri"/>
         </w:rPr>
-        <w:t xml:space="preserve">What I bring first is architectural ownership of store technology: standards, lifecycle, and designs that operations can support. At CGI I worked on the store estate that supports Rituals and similar retail — Meraki networking, POS and payment terminals, multi-site rollout, and handover into support. I was involved with the team that moved POS off Cowhills onto NewBlack (iPads on the floor; Mac in the back room). I use Jira and Confluence daily, and when CGI rolled ServiceNow out to stores as incident management I was involved at the edge of that programme and completed CGI’s training.</w:t>
+        <w:t xml:space="preserve">At CGI I worked with the team responsible for network architecture across 1000+ retail stores — Meraki networking, POS and payment terminals, multi-site rollout and handover into support. I was part of the team that moved store POS off Cowhills onto NewBlack, with iPads on the floor and a Mac in the back room. I know how CGI’s call-centre model works with the stores, I have worked with Veducon, and I understand how the wider partner model fits together: Veducon for network design, CGI with NewBlack for omnichannel, RSG for in-store rollout and break-fix. I continued as Principal Architect for Suitsupply under contract with CGI until 2024.</w:t>
       </w:r>
     </w:p>
     <w:p>
@@ -111,7 +95,7 @@
           <w:szCs w:val="22"/>
           <w:rFonts w:ascii="Calibri" w:cs="Calibri" w:eastAsia="Calibri" w:hAnsi="Calibri"/>
         </w:rPr>
-        <w:t xml:space="preserve">I also understand how Rituals’ vendors fit together — for example Veducon for network design, CGI with NewBlack for omnichannel, and RSG for in-store rollout and break-fix — and I already have working relationships from CGI and later ZZP work. For 15 years at Allan Gray I managed contractors in financial services, so I am used to holding partners to standard, not only designing the stack.</w:t>
+        <w:t xml:space="preserve">Before that I spent 15 years at Allan Gray owning network architecture and managing contractors and third-party vendors for South Africa’s largest private asset manager. That is the muscle this role needs when it asks for architecture principles, lifecycle management and supplier adherence rather than one-off designs.</w:t>
       </w:r>
     </w:p>
     <w:p>
@@ -127,7 +111,7 @@
           <w:szCs w:val="22"/>
           <w:rFonts w:ascii="Calibri" w:cs="Calibri" w:eastAsia="Calibri" w:hAnsi="Calibri"/>
         </w:rPr>
-        <w:t xml:space="preserve">After CGI I continued as a sole proprietor under contract with CGI as Principal Architect for Suitsupply until 2024. Since November 2024 I have been a platform engineer at Just Eat Takeaway. That platform work, including AI-assisted ways of spotting and fixing operational issues, is how I would help Rituals move toward the proactive and predictive technology management described in the role.</w:t>
+        <w:t xml:space="preserve">Since November 2024 I have been a platform engineer at Just Eat Takeaway. I root-cause production incidents across AWS, Kubernetes, DNS and IAM, and I have built AI agent tooling that codifies those investigations so the same problem is not solved twice. I use Jira and Confluence every day, and I completed CGI’s ServiceNow training when it was rolled out to stores for incident management. On the Apple side I understand how Jamf and MDM fit an iPad-and-Mac store estate; I would describe that as working knowledge rather than Jamf administration, and I would say so in the interview.</w:t>
       </w:r>
     </w:p>
     <w:p>
@@ -143,7 +127,7 @@
           <w:szCs w:val="22"/>
           <w:rFonts w:ascii="Calibri" w:cs="Calibri" w:eastAsia="Calibri" w:hAnsi="Calibri"/>
         </w:rPr>
-        <w:t xml:space="preserve">I am based in Almere, close to Amsterdam, with a residence permit (arbeid vrij toegestaan, TWV niet vereist).</w:t>
+        <w:t xml:space="preserve">I live in Almere, close to Amsterdam, so an office-first week is practical. I hold a residence permit with arbeid vrij toegestaan, TWV niet vereist.</w:t>
       </w:r>
     </w:p>
     <w:p>
@@ -159,7 +143,7 @@
           <w:szCs w:val="22"/>
           <w:rFonts w:ascii="Calibri" w:cs="Calibri" w:eastAsia="Calibri" w:hAnsi="Calibri"/>
         </w:rPr>
-        <w:t xml:space="preserve">I would welcome the conversation with Renée and the team.</w:t>
+        <w:t xml:space="preserve">I would welcome the conversation.</w:t>
       </w:r>
     </w:p>
     <w:p>
@@ -196,34 +180,18 @@
     </w:p>
     <w:p>
       <w:pPr>
-        <w:spacing w:after="160" w:line="276"/>
-      </w:pPr>
-      <w:r>
-        <w:rPr>
-          <w:b w:val="false"/>
-          <w:bCs w:val="false"/>
-          <w:color w:val="1A2332"/>
-          <w:sz w:val="22"/>
-          <w:szCs w:val="22"/>
-          <w:rFonts w:ascii="Calibri" w:cs="Calibri" w:eastAsia="Calibri" w:hAnsi="Calibri"/>
-        </w:rPr>
-        <w:t xml:space="preserve">+31 6 27517972</w:t>
-      </w:r>
-    </w:p>
-    <w:p>
-      <w:pPr>
-        <w:spacing w:after="160" w:line="276"/>
-      </w:pPr>
-      <w:r>
-        <w:rPr>
-          <w:b w:val="false"/>
-          <w:bCs w:val="false"/>
-          <w:color w:val="1A2332"/>
-          <w:sz w:val="22"/>
-          <w:szCs w:val="22"/>
-          <w:rFonts w:ascii="Calibri" w:cs="Calibri" w:eastAsia="Calibri" w:hAnsi="Calibri"/>
-        </w:rPr>
-        <w:t xml:space="preserve">Clinton.herring@remoteconsulting.eu</w:t>
+        <w:spacing w:after="40" w:line="276"/>
+      </w:pPr>
+      <w:r>
+        <w:rPr>
+          <w:b w:val="false"/>
+          <w:bCs w:val="false"/>
+          <w:color w:val="1A2332"/>
+          <w:sz w:val="22"/>
+          <w:szCs w:val="22"/>
+          <w:rFonts w:ascii="Calibri" w:cs="Calibri" w:eastAsia="Calibri" w:hAnsi="Calibri"/>
+        </w:rPr>
+        <w:t xml:space="preserve">+31 6 27517972  ·  Clinton.herring@remoteconsulting.eu</w:t>
       </w:r>
     </w:p>
     <w:sectPr>
@@ -363,6 +331,18 @@
       </w:pPr>
     </w:lvl>
   </w:abstractNum>
+  <w:abstractNum w:abstractNumId="2" w15:restartNumberingAfterBreak="0">
+    <w:multiLevelType w:val="hybridMultilevel"/>
+    <w:lvl w:ilvl="0" w15:tentative="1">
+      <w:start w:val="1"/>
+      <w:numFmt w:val="bullet"/>
+      <w:lvlText w:val="•"/>
+      <w:lvlJc w:val="left"/>
+      <w:pPr>
+        <w:ind w:left="360" w:hanging="180"/>
+      </w:pPr>
+    </w:lvl>
+  </w:abstractNum>
   <w:num w:numId="1">
     <w:abstractNumId w:val="1"/>
     <w:lvlOverride w:ilvl="0">
@@ -375,7 +355,14 @@
 <file path=word/styles.xml><?xml version="1.0" encoding="utf-8"?>
 <w:styles xmlns:mc="http://schemas.openxmlformats.org/markup-compatibility/2006" xmlns:r="http://schemas.openxmlformats.org/officeDocument/2006/relationships" xmlns:w="http://schemas.openxmlformats.org/wordprocessingml/2006/main" xmlns:w14="http://schemas.microsoft.com/office/word/2010/wordml" xmlns:w15="http://schemas.microsoft.com/office/word/2012/wordml" mc:Ignorable="w14 w15">
   <w:docDefaults>
-    <w:rPrDefault/>
+    <w:rPrDefault>
+      <w:rPr>
+        <w:color w:val="1A2332"/>
+        <w:sz w:val="20"/>
+        <w:szCs w:val="20"/>
+        <w:rFonts w:ascii="Calibri" w:cs="Calibri" w:eastAsia="Calibri" w:hAnsi="Calibri"/>
+      </w:rPr>
+    </w:rPrDefault>
     <w:pPrDefault/>
   </w:docDefaults>
   <w:style w:type="paragraph" w:styleId="Title">
@@ -512,5 +499,23 @@
       <w:szCs w:val="20"/>
     </w:rPr>
   </w:style>
+  <w:style w:type="paragraph" w:styleId="Heading1">
+    <w:name w:val="Heading 1"/>
+    <w:basedOn w:val="Normal"/>
+    <w:next w:val="Normal"/>
+    <w:qFormat/>
+    <w:pPr>
+      <w:spacing w:before="260" w:after="100"/>
+      <w:outlineLvl w:val="0"/>
+    </w:pPr>
+    <w:rPr>
+      <w:b/>
+      <w:bCs/>
+      <w:color w:val="2C3E50"/>
+      <w:sz w:val="20"/>
+      <w:szCs w:val="20"/>
+      <w:rFonts w:ascii="Calibri" w:cs="Calibri" w:eastAsia="Calibri" w:hAnsi="Calibri"/>
+    </w:rPr>
+  </w:style>
 </w:styles>
 </file>
</xml_diff>

<commit_message>
Rewrite Rituals CV and letter in Clinton's voice; lead with JET role; scannable layout
Co-authored-by: clintonherring <clintonherring@users.noreply.github.com>
</commit_message>
<xml_diff>
--- a/skills/custom/clinton-cv/assets/Clinton_Herring_Rituals_Cover_Letter.docx
+++ b/skills/custom/clinton-cv/assets/Clinton_Herring_Rituals_Cover_Letter.docx
@@ -63,7 +63,7 @@
           <w:szCs w:val="22"/>
           <w:rFonts w:ascii="Calibri" w:cs="Calibri" w:eastAsia="Calibri" w:hAnsi="Calibri"/>
         </w:rPr>
-        <w:t xml:space="preserve">I am applying for the Retail Technology IT Architect role. I know the Rituals store landscape from the supplier side, and I have spent the last few years doing exactly the work this role describes: owning store-technology architecture, holding partners to standards, and turning recurring incidents into structural fixes.</w:t>
+        <w:t xml:space="preserve">I am applying for the Retail Technology IT Architect role. I know the Rituals store environment from the supplier side, and the work in this role is the work I have been doing for the last few years: store technology architecture, keeping partners to the standards, and making sure that when something breaks the fix goes into the standard and not just the ticket.</w:t>
       </w:r>
     </w:p>
     <w:p>
@@ -79,7 +79,7 @@
           <w:szCs w:val="22"/>
           <w:rFonts w:ascii="Calibri" w:cs="Calibri" w:eastAsia="Calibri" w:hAnsi="Calibri"/>
         </w:rPr>
-        <w:t xml:space="preserve">At CGI I worked with the team responsible for network architecture across 1000+ retail stores — Meraki networking, POS and payment terminals, multi-site rollout and handover into support. I was part of the team that moved store POS off Cowhills onto NewBlack, with iPads on the floor and a Mac in the back room. I know how CGI’s call-centre model works with the stores, I have worked with Veducon, and I understand how the wider partner model fits together: Veducon for network design, CGI with NewBlack for omnichannel, RSG for in-store rollout and break-fix. Since 2022 I have worked for myself; part of that work was as a sub-contractor to CGI for another retailer, Suitsupply, until October 2024 — so my retail experience is not limited to one brand.</w:t>
+        <w:t xml:space="preserve">At CGI I was part of the team responsible for network architecture across 1000+ Rituals stores: Meraki networking, POS and payment terminals, rollouts to many stores at once and handover to support. I was part of the team that replaced Cowhills with NewBlack POS, with iPads on the floor and a Mac in the back room. I know how the CGI call centre works with the stores, I have worked with Veducon, and I know how the partners fit together: Veducon for network design, CGI with NewBlack for omnichannel, RSG for rollouts and break-fix in the stores. From 2022 to October 2024 I worked for myself, and most of that was as a sub-contractor to CGI for another retailer, Suitsupply, so my retail experience is not based on one brand.</w:t>
       </w:r>
     </w:p>
     <w:p>
@@ -95,7 +95,7 @@
           <w:szCs w:val="22"/>
           <w:rFonts w:ascii="Calibri" w:cs="Calibri" w:eastAsia="Calibri" w:hAnsi="Calibri"/>
         </w:rPr>
-        <w:t xml:space="preserve">Before that I spent 15 years at Allan Gray owning network architecture and managing contractors and third-party vendors for South Africa’s largest private asset manager. That is the muscle this role needs when it asks for architecture principles, lifecycle management and supplier adherence rather than one-off designs.</w:t>
+        <w:t xml:space="preserve">Before that I spent 15 years at Allan Gray, the largest private asset manager in South Africa, where I was responsible for the network architecture and managed the 3rd party vendors and contractors. That is where I learned to set architecture principles, manage the lifecycle of infrastructure and hold suppliers to what they agreed to, rather than doing one-off designs.</w:t>
       </w:r>
     </w:p>
     <w:p>
@@ -111,7 +111,7 @@
           <w:szCs w:val="22"/>
           <w:rFonts w:ascii="Calibri" w:cs="Calibri" w:eastAsia="Calibri" w:hAnsi="Calibri"/>
         </w:rPr>
-        <w:t xml:space="preserve">Since November 2024 I have been a platform engineer at Just Eat Takeaway. I root-cause production incidents across AWS, Kubernetes, DNS and IAM, and I have built AI agent tooling that codifies those investigations so the same problem is not solved twice. I also managed Entra ID for internal users for about a year, until identity was consolidated into a single department. I use Jira and Confluence every day, and I completed CGI’s ServiceNow training when it was rolled out to stores for incident management. On the Apple side I understand how Jamf and MDM fit an iPad-and-Mac store estate; I would describe that as working knowledge rather than Jamf administration, and I would say so in the interview.</w:t>
+        <w:t xml:space="preserve">Since November 2024 I have been a platform engineer at Just Eat Takeaway. I find the root cause of production incidents across AWS, Kubernetes, DNS and IAM, and I have built AI agent tooling that captures how we investigate so the same problem does not get solved twice. I also managed Entra ID for internal users for about a year, until identity was brought together under one department. I use Jira and Confluence every day, and I did CGI’s ServiceNow training when it was rolled out to the stores for incident management. On the Apple side I know how Jamf and MDM fit an iPad and Mac store estate; I would call that working knowledge rather than Jamf administration, and I would say so in the interview.</w:t>
       </w:r>
     </w:p>
     <w:p>
@@ -127,7 +127,7 @@
           <w:szCs w:val="22"/>
           <w:rFonts w:ascii="Calibri" w:cs="Calibri" w:eastAsia="Calibri" w:hAnsi="Calibri"/>
         </w:rPr>
-        <w:t xml:space="preserve">I live in Almere, close to Amsterdam, so an office-first week is practical. I hold a residence permit with arbeid vrij toegestaan, TWV niet vereist.</w:t>
+        <w:t xml:space="preserve">I live in Almere, close to Amsterdam, so being in the office most of the week is practical. I have a residence permit with arbeid vrij toegestaan, TWV niet vereist.</w:t>
       </w:r>
     </w:p>
     <w:p>
@@ -143,7 +143,7 @@
           <w:szCs w:val="22"/>
           <w:rFonts w:ascii="Calibri" w:cs="Calibri" w:eastAsia="Calibri" w:hAnsi="Calibri"/>
         </w:rPr>
-        <w:t xml:space="preserve">I would welcome the conversation.</w:t>
+        <w:t xml:space="preserve">I would welcome the chance to talk about the role.</w:t>
       </w:r>
     </w:p>
     <w:p>

</xml_diff>